<commit_message>
docs: memoria técnica con cabeceras de seguridad, plantillas, revisión de seguridad y cifras de la corrida final
</commit_message>
<xml_diff>
--- a/Laburin-Memoria-Tecnica.docx
+++ b/Laburin-Memoria-Tecnica.docx
@@ -1251,6 +1251,64 @@
     </w:p>
     <w:p>
       <w:pPr>
+        <w:pStyle w:val="Heading2"/>
+        <w:spacing w:after="140" w:before="280"/>
+      </w:pPr>
+      <w:r>
+        <w:t xml:space="preserve">5.12 Cabeceras de seguridad y política de contenido</w:t>
+      </w:r>
+    </w:p>
+    <w:p>
+      <w:pPr>
+        <w:spacing w:after="160"/>
+      </w:pPr>
+      <w:r>
+        <w:t xml:space="preserve">Producción enviaba solo la cabecera de transporte seguro que agrega Vercel; faltaban las que protegen al navegador. Se configuraron en vercel.json para todas las rutas: una política de contenido (CSP) cerrada por defecto, protección contra el clickjacking (X-Frame-Options y frame-ancestors en «none»), nosniff, una política de referer, una política de permisos que apaga la cámara, el micrófono y la geolocalización, y el aislamiento de la ventana (COOP).</w:t>
+      </w:r>
+    </w:p>
+    <w:p>
+      <w:pPr>
+        <w:spacing w:after="160"/>
+      </w:pPr>
+      <w:r>
+        <w:t xml:space="preserve">Decisión con alternativa: los scripts solo se permiten desde el propio sitio, sin «unsafe-inline» ni «unsafe-eval», que es lo que realmente frena un XSS. En cambio los estilos sí permiten «unsafe-inline»: la alternativa, un nonce distinto por respuesta, no es posible con un sitio estático servido por Vercel, y React escribe estilos en línea (por ejemplo en las barras de progreso y en los gráficos). Es un riesgo menor, porque un estilo no ejecuta código. Las conexiones salen solo hacia Supabase (https y wss) y las dos fuentes de ofertas, y Google Fonts es el único recurso externo permitido.</w:t>
+      </w:r>
+    </w:p>
+    <w:p>
+      <w:pPr>
+        <w:spacing w:after="160"/>
+      </w:pPr>
+      <w:r>
+        <w:t xml:space="preserve">La política se verificó contra la aplicación real y no solo escrita: se hizo un build de producción, se lo sirvió con exactamente esas cabeceras y se recorrieron todas las pantallas del candidato y del administrador, incluidos los gráficos y las fuentes, sin una sola violación. Un test unitario lee vercel.json y falla si alguien afloja la política.</w:t>
+      </w:r>
+    </w:p>
+    <w:p>
+      <w:pPr>
+        <w:pStyle w:val="Heading2"/>
+        <w:spacing w:after="140" w:before="280"/>
+      </w:pPr>
+      <w:r>
+        <w:t xml:space="preserve">5.13 Plantillas de mensaje con campos por completar</w:t>
+      </w:r>
+    </w:p>
+    <w:p>
+      <w:pPr>
+        <w:spacing w:after="160"/>
+      </w:pPr>
+      <w:r>
+        <w:t xml:space="preserve">Para que escribirle a un candidato sea simple, el administrador puede partir de cinco plantillas (por ejemplo, «Solicitud recibida» y «Falta un dato»). Saludan por el primer nombre y evitan el género de la persona, porque el nombre no lo indica. Lo que va entre corchetes es un dato por completar: queda seleccionado para escribir encima, y el envío se bloquea mientras haya corchetes sin reemplazar, para que nunca salga un mensaje con un «[indicá cuál]» a medias. Aplicar una plantilla sobre un texto ya escrito se puede deshacer.</w:t>
+      </w:r>
+    </w:p>
+    <w:p>
+      <w:pPr>
+        <w:spacing w:after="160"/>
+      </w:pPr>
+      <w:r>
+        <w:t xml:space="preserve">La recuperación de contraseña también se rediseñó en tres pasos visibles (pedir el enlace, revisar el correo y elegir la contraseña), con una pantalla «Revisá tu correo» que explica qué hacer si el mail no llega, un reenvío con cuenta regresiva (el servicio permite un envío por minuto), una lista de requisitos que se tilda en vivo y un mail propio en español (docs/plantillas-email), cuyo contenido cuida un test.</w:t>
+      </w:r>
+    </w:p>
+    <w:p>
+      <w:pPr>
         <w:pStyle w:val="Heading1"/>
         <w:spacing w:after="200" w:before="400"/>
       </w:pPr>
@@ -1480,6 +1538,101 @@
         <w:spacing w:after="140" w:before="280"/>
       </w:pPr>
       <w:r>
+        <w:t xml:space="preserve">Revisión de seguridad de la aplicación</w:t>
+      </w:r>
+    </w:p>
+    <w:p>
+      <w:pPr>
+        <w:spacing w:after="160"/>
+      </w:pPr>
+      <w:r>
+        <w:t xml:space="preserve">Además de la base de datos, se revisó la aplicación web con la metodología de auditoría de cabeceras y de pruebas de XSS, y se corrigió lo encontrado:</w:t>
+      </w:r>
+    </w:p>
+    <w:p>
+      <w:pPr>
+        <w:pStyle w:val="ListParagraph"/>
+        <w:numPr>
+          <w:ilvl w:val="0"/>
+          <w:numId w:val="2"/>
+        </w:numPr>
+        <w:spacing w:after="80"/>
+      </w:pPr>
+      <w:r>
+        <w:t xml:space="preserve">Cabeceras HTTP: producción enviaba solo HSTS. Se agregaron la política de contenido y el resto (Sección 5.12), verificadas sin violaciones y protegidas por un test.</w:t>
+      </w:r>
+    </w:p>
+    <w:p>
+      <w:pPr>
+        <w:pStyle w:val="ListParagraph"/>
+        <w:numPr>
+          <w:ilvl w:val="0"/>
+          <w:numId w:val="2"/>
+        </w:numPr>
+        <w:spacing w:after="80"/>
+      </w:pPr>
+      <w:r>
+        <w:t xml:space="preserve">Inyección de código (XSS): el código fuente no usa innerHTML ni dangerouslySetInnerHTML, y no hay enlaces externos que abran pestañas sin protección. Una prueba con navegador real carga código malicioso en el nombre, el rol, la ubicación y las tecnologías de un candidato (lo que después ve el administrador), en un mensaje y en ofertas importadas, y comprueba que todo se ve como texto y nada se ejecuta. Se comprobó también que la prueba detecta el fallo: al introducirlo a propósito, se pone en rojo.</w:t>
+      </w:r>
+    </w:p>
+    <w:p>
+      <w:pPr>
+        <w:pStyle w:val="ListParagraph"/>
+        <w:numPr>
+          <w:ilvl w:val="0"/>
+          <w:numId w:val="2"/>
+        </w:numPr>
+        <w:spacing w:after="80"/>
+      </w:pPr>
+      <w:r>
+        <w:t xml:space="preserve">Dependencias: se corrigió una vulnerabilidad alta (source-map-js, denegación de servicio). Para lo que se despliega, la auditoría de npm informa 0 vulnerabilidades; quedan 3 moderadas en una herramienta de desarrollo (la que genera los PDF), que no forma parte de la aplicación.</w:t>
+      </w:r>
+    </w:p>
+    <w:p>
+      <w:pPr>
+        <w:pStyle w:val="ListParagraph"/>
+        <w:numPr>
+          <w:ilvl w:val="0"/>
+          <w:numId w:val="2"/>
+        </w:numPr>
+        <w:spacing w:after="80"/>
+      </w:pPr>
+      <w:r>
+        <w:t xml:space="preserve">Secretos: no hay claves en el historial de git (se buscaron claves JWT, service role y archivos .env versionados); la aplicación solo usa la clave pública anon.</w:t>
+      </w:r>
+    </w:p>
+    <w:p>
+      <w:pPr>
+        <w:pStyle w:val="ListParagraph"/>
+        <w:numPr>
+          <w:ilvl w:val="0"/>
+          <w:numId w:val="2"/>
+        </w:numPr>
+        <w:spacing w:after="80"/>
+      </w:pPr>
+      <w:r>
+        <w:t xml:space="preserve">Accesibilidad y diseño responsive: una auditoría automática (axe-core, WCAG A y AA) de todas las pantallas y los modales, en tema claro y oscuro, encontró un único problema de contraste, ya corregido; y una prueba verifica que ninguna pantalla se salga del ancho de un celular de 320 px. Ambas quedan como pruebas permanentes.</w:t>
+      </w:r>
+    </w:p>
+    <w:p>
+      <w:pPr>
+        <w:pStyle w:val="ListParagraph"/>
+        <w:numPr>
+          <w:ilvl w:val="0"/>
+          <w:numId w:val="2"/>
+        </w:numPr>
+        <w:spacing w:after="80"/>
+      </w:pPr>
+      <w:r>
+        <w:t xml:space="preserve">Pendiente del lado del panel de Supabase (no se puede hacer desde el código): largo mínimo de contraseña de 8 en el servidor, protección contra contraseñas filtradas si el plan la incluye y el correo propio. Están explicados paso a paso en docs/guia-supabase.md.</w:t>
+      </w:r>
+    </w:p>
+    <w:p>
+      <w:pPr>
+        <w:pStyle w:val="Heading2"/>
+        <w:spacing w:after="140" w:before="280"/>
+      </w:pPr>
+      <w:r>
         <w:t xml:space="preserve">Límites</w:t>
       </w:r>
     </w:p>
@@ -1645,7 +1798,7 @@
         <w:spacing w:after="160"/>
       </w:pPr>
       <w:r>
-        <w:t xml:space="preserve">Cifras de la corrida final completa (desktop y mobile, contra la base real): 244 tests unitarios de Vitest en 22 archivos y 93 tests de Playwright, todos en verde y ninguno salteado. De los 93, 2 son sesiones de preparación, 51 corren en desktop (13 de ellos son las pruebas de seguridad, que hablan directo con la API y por eso corren una sola vez) y 40 corren en mobile. El test del teclado virtual solo aplica a mobile y se excluye del proyecto desktop por configuración, en lugar de figurar como salteado en cada corrida.</w:t>
+        <w:t xml:space="preserve">Cifras de la corrida final completa (desktop y mobile, contra la base real): 277 tests unitarios de Vitest en 26 archivos y 112 tests de Playwright, ninguno salteado. De los 112, 2 son sesiones de preparación, 61 corren en desktop (13 de ellos son las pruebas de seguridad contra la base, que hablan directo con la API y por eso corren una sola vez) y 49 corren en mobile. En la corrida completa pasaron 111 y uno falló una vez por una interrupción de red; repetido solo, pasó las 3 veces. El test del teclado virtual solo aplica a mobile y se excluye del proyecto desktop por configuración, en lugar de figurar como salteado en cada corrida.</w:t>
       </w:r>
     </w:p>
     <w:p>
@@ -1957,6 +2110,32 @@
       </w:pPr>
       <w:r>
         <w:t xml:space="preserve">El indicador de fortaleza de contraseña orienta pero no bloquea: con 8 caracteres o más se puede elegir una contraseña que el medidor marca como débil.</w:t>
+      </w:r>
+    </w:p>
+    <w:p>
+      <w:pPr>
+        <w:pStyle w:val="ListParagraph"/>
+        <w:numPr>
+          <w:ilvl w:val="0"/>
+          <w:numId w:val="2"/>
+        </w:numPr>
+        <w:spacing w:after="80"/>
+      </w:pPr>
+      <w:r>
+        <w:t xml:space="preserve">La política de contenido permite estilos en línea («unsafe-inline» solo para estilos, nunca para scripts): React y los gráficos los necesitan y un sitio estático no puede usar un nonce por respuesta (Sección 5.12).</w:t>
+      </w:r>
+    </w:p>
+    <w:p>
+      <w:pPr>
+        <w:pStyle w:val="ListParagraph"/>
+        <w:numPr>
+          <w:ilvl w:val="0"/>
+          <w:numId w:val="2"/>
+        </w:numPr>
+        <w:spacing w:after="80"/>
+      </w:pPr>
+      <w:r>
+        <w:t xml:space="preserve">La auditoría de accesibilidad es automática (axe-core): detecta los errores más comunes, pero no reemplaza una revisión manual con lector de pantalla ni con usuarios reales.</w:t>
       </w:r>
     </w:p>
     <w:p>
@@ -4461,13 +4640,87 @@
           </w:p>
         </w:tc>
       </w:tr>
+      <w:tr>
+        <w:tc>
+          <w:tcPr>
+            <w:tcW w:type="dxa" w:w="1100"/>
+            <w:tcMar>
+              <w:top w:type="dxa" w:w="60"/>
+              <w:left w:type="dxa" w:w="100"/>
+              <w:bottom w:type="dxa" w:w="60"/>
+              <w:right w:type="dxa" w:w="100"/>
+            </w:tcMar>
+            <w:vAlign w:val="center"/>
+          </w:tcPr>
+          <w:p>
+            <w:r>
+              <w:rPr>
+                <w:b/>
+                <w:bCs/>
+                <w:color w:val="1A1A1A"/>
+                <w:sz w:val="19"/>
+                <w:szCs w:val="19"/>
+              </w:rPr>
+              <w:t xml:space="preserve">AMP-08</w:t>
+            </w:r>
+          </w:p>
+        </w:tc>
+        <w:tc>
+          <w:tcPr>
+            <w:tcW w:type="dxa" w:w="1700"/>
+            <w:tcMar>
+              <w:top w:type="dxa" w:w="60"/>
+              <w:left w:type="dxa" w:w="100"/>
+              <w:bottom w:type="dxa" w:w="60"/>
+              <w:right w:type="dxa" w:w="100"/>
+            </w:tcMar>
+            <w:vAlign w:val="center"/>
+          </w:tcPr>
+          <w:p>
+            <w:r>
+              <w:rPr>
+                <w:b/>
+                <w:bCs/>
+                <w:color w:val="1A7F37"/>
+                <w:sz w:val="19"/>
+                <w:szCs w:val="19"/>
+              </w:rPr>
+              <w:t xml:space="preserve">Cumplido</w:t>
+            </w:r>
+          </w:p>
+        </w:tc>
+        <w:tc>
+          <w:tcPr>
+            <w:tcW w:type="dxa" w:w="6226"/>
+            <w:tcMar>
+              <w:top w:type="dxa" w:w="60"/>
+              <w:left w:type="dxa" w:w="100"/>
+              <w:bottom w:type="dxa" w:w="60"/>
+              <w:right w:type="dxa" w:w="100"/>
+            </w:tcMar>
+            <w:vAlign w:val="center"/>
+          </w:tcPr>
+          <w:p>
+            <w:r>
+              <w:rPr>
+                <w:b w:val="false"/>
+                <w:bCs w:val="false"/>
+                <w:color w:val="1A1A1A"/>
+                <w:sz w:val="19"/>
+                <w:szCs w:val="19"/>
+              </w:rPr>
+              <w:t xml:space="preserve">Plantillas de mensaje para el administrador, con campos por completar y deshacer (Sección 5.13).</w:t>
+            </w:r>
+          </w:p>
+        </w:tc>
+      </w:tr>
     </w:tbl>
     <w:p>
       <w:pPr>
         <w:spacing w:after="160" w:before="280"/>
       </w:pPr>
       <w:r>
-        <w:t xml:space="preserve">En síntesis: de los 17 RF originales, 12 se cumplieron (10 tal como fueron especificados, 1 ampliado — RF-10 — y 1 cumplido con matices — RF-13), 3 se cumplieron parcialmente (RF-01, RF-04, RF-05) y 2 no se implementaron (RF-03, RF-16). De los 5 RNF, 3 se cumplieron, 1 se amplió deliberadamente por sobre lo previsto (RNF-02) y 1 no se cumplió (RNF-05). A eso se suman las 7 ampliaciones acordadas con la docente el 08/10/2026: 6 cumplidas y 1 con matices (la recuperación de contraseña depende del correo configurado). Ninguno de los recortes fue accidental: cada uno queda documentado con su alternativa descartada en la Sección 5 o como limitación conocida en la Sección 9, en vez de quedar implícito.</w:t>
+        <w:t xml:space="preserve">En síntesis: de los 17 RF originales, 12 se cumplieron (10 tal como fueron especificados, 1 ampliado — RF-10 — y 1 cumplido con matices — RF-13), 3 se cumplieron parcialmente (RF-01, RF-04, RF-05) y 2 no se implementaron (RF-03, RF-16). De los 5 RNF, 3 se cumplieron, 1 se amplió deliberadamente por sobre lo previsto (RNF-02) y 1 no se cumplió (RNF-05). A eso se suman las 8 ampliaciones acordadas con la docente el 08/10/2026: 7 cumplidas y 1 con matices (la recuperación de contraseña depende del correo configurado). Ninguno de los recortes fue accidental: cada uno queda documentado con su alternativa descartada en la Sección 5 o como limitación conocida en la Sección 9, en vez de quedar implícito.</w:t>
       </w:r>
     </w:p>
     <w:sectPr>

</xml_diff>

<commit_message>
docs: memoria técnica con la cuenta de demostración y las cifras de pruebas actualizadas
</commit_message>
<xml_diff>
--- a/Laburin-Memoria-Tecnica.docx
+++ b/Laburin-Memoria-Tecnica.docx
@@ -1309,6 +1309,39 @@
     </w:p>
     <w:p>
       <w:pPr>
+        <w:pStyle w:val="Heading2"/>
+        <w:spacing w:after="140" w:before="280"/>
+      </w:pPr>
+      <w:r>
+        <w:t xml:space="preserve">5.14 Una cuenta de demostración que se arma por código</w:t>
+      </w:r>
+    </w:p>
+    <w:p>
+      <w:pPr>
+        <w:spacing w:after="160"/>
+      </w:pPr>
+      <w:r>
+        <w:t xml:space="preserve">Para mostrar la aplicación con la historia de alguien que la usa hace tiempo, hacía falta una cuenta con todos los casos de uso cargados: ofertas con puntajes altos, medios y bajos, postulaciones en los seis estados, interacciones de los cuatro tipos, recordatorios activos y resueltos, un criterio de scoring apagado y mensajes leídos y sin leer. Cargarla a mano en cada demostración era lento y no se podía repetir.</w:t>
+      </w:r>
+    </w:p>
+    <w:p>
+      <w:pPr>
+        <w:spacing w:after="160"/>
+      </w:pPr>
+      <w:r>
+        <w:t xml:space="preserve">Decisión con alternativa: se armó con un script (npm run demo:datos) y no con un volcado de la base ni con un SQL de datos de ejemplo. Un SQL habría exigido la service role key para saltear las reglas de acceso, y el proyecto se comprometió a no usarla. El script entra con la sesión de cada cuenta y escribe por las mismas reglas de acceso que la aplicación; los mensajes los envía la cuenta de administrador de pruebas, porque solo ella puede escribirlos. Las fechas se expresan como «hace N días», así que cada vez que se corre la historia queda reciente, y como el comando reinicia la cuenta si ya existe, se puede repetir antes de cada presentación.</w:t>
+      </w:r>
+    </w:p>
+    <w:p>
+      <w:pPr>
+        <w:spacing w:after="160"/>
+      </w:pPr>
+      <w:r>
+        <w:t xml:space="preserve">Cada postulación se crea en «Por aplicar» y recorre sus estados uno a uno: de esa forma el disparador de la base arma el historial real que usa el embudo de Mi progreso, en lugar de escribirlo directamente (los clientes no pueden hacerlo). Los datos viven en una función pura (docs/scripts/demo-dataset.mjs) que un test compara con el motor de scoring, los recordatorios y las métricas de la propia aplicación: si alguien cambia una regla y los datos de la demostración dejan de ser coherentes, el test falla.</w:t>
+      </w:r>
+    </w:p>
+    <w:p>
+      <w:pPr>
         <w:pStyle w:val="Heading1"/>
         <w:spacing w:after="200" w:before="400"/>
       </w:pPr>
@@ -1798,7 +1831,7 @@
         <w:spacing w:after="160"/>
       </w:pPr>
       <w:r>
-        <w:t xml:space="preserve">Cifras de la corrida final completa (desktop y mobile, contra la base real): 277 tests unitarios de Vitest en 26 archivos y 112 tests de Playwright, ninguno salteado. De los 112, 2 son sesiones de preparación, 61 corren en desktop (13 de ellos son las pruebas de seguridad contra la base, que hablan directo con la API y por eso corren una sola vez) y 49 corren en mobile. En la corrida completa pasaron 111 y uno falló una vez por una interrupción de red; repetido solo, pasó las 3 veces. El test del teclado virtual solo aplica a mobile y se excluye del proyecto desktop por configuración, en lugar de figurar como salteado en cada corrida.</w:t>
+        <w:t xml:space="preserve">Cifras de la corrida final completa (desktop y mobile, contra la base real): 286 tests unitarios de Vitest en 27 archivos y 112 tests de Playwright, ninguno salteado. De los 112, 2 son sesiones de preparación, 61 corren en desktop (13 de ellos son las pruebas de seguridad contra la base, que hablan directo con la API y por eso corren una sola vez) y 49 corren en mobile. En la corrida completa pasaron 111 y uno falló una vez por una interrupción de red; repetido solo, pasó las 3 veces. El test del teclado virtual solo aplica a mobile y se excluye del proyecto desktop por configuración, en lugar de figurar como salteado en cada corrida.</w:t>
       </w:r>
     </w:p>
     <w:p>
@@ -1815,6 +1848,31 @@
         <w:spacing w:after="140" w:before="280"/>
       </w:pPr>
       <w:r>
+        <w:t xml:space="preserve">Cuenta de demostración</w:t>
+      </w:r>
+    </w:p>
+    <w:p>
+      <w:pPr>
+        <w:spacing w:after="160"/>
+      </w:pPr>
+      <w:r>
+        <w:t xml:space="preserve">La cuenta DEMO se carga con npm run demo:datos y tiene su propio test unitario (9 pruebas). Comprueba que el puntaje guardado de cada oferta es el que calcula el motor de la aplicación; que están todos los casos (seis estados, cuatro tipos de interacción, tres modalidades y tres fuentes); que no hay ofertas repetidas ni fechas futuras ni interacciones anteriores a su postulación; que al abrir Mis postulaciones no se genera ningún recordatorio nuevo (los dos avisos que se ven ya están cargados); que Mi progreso queda con datos en todas sus tarjetas y gráficos (el embudo baja de 15 a 12, 7, 4 y 1 postulaciones); y que los mensajes son los de las plantillas. Se verificó, además, que las pruebas detectan los fallos: al introducir a propósito una postulación sin actividad reciente y un error en el cálculo del puntaje, se ponen en rojo.</w:t>
+      </w:r>
+    </w:p>
+    <w:p>
+      <w:pPr>
+        <w:spacing w:after="160"/>
+      </w:pPr>
+      <w:r>
+        <w:t xml:space="preserve">También se cargó la cuenta en la base real y se la recorrió en producción: Mis postulaciones muestra los dos recordatorios («Sin novedades hace 15 y 9 días»), Mi progreso muestra una tasa de respuesta del 67 % y Mensajes muestra el contador con uno sin leer.</w:t>
+      </w:r>
+    </w:p>
+    <w:p>
+      <w:pPr>
+        <w:pStyle w:val="Heading2"/>
+        <w:spacing w:after="140" w:before="280"/>
+      </w:pPr>
+      <w:r>
         <w:t xml:space="preserve">Bugs de producción</w:t>
       </w:r>
     </w:p>
@@ -2110,6 +2168,19 @@
       </w:pPr>
       <w:r>
         <w:t xml:space="preserve">El indicador de fortaleza de contraseña orienta pero no bloquea: con 8 caracteres o más se puede elegir una contraseña que el medidor marca como débil.</w:t>
+      </w:r>
+    </w:p>
+    <w:p>
+      <w:pPr>
+        <w:pStyle w:val="ListParagraph"/>
+        <w:numPr>
+          <w:ilvl w:val="0"/>
+          <w:numId w:val="2"/>
+        </w:numPr>
+        <w:spacing w:after="80"/>
+      </w:pPr>
+      <w:r>
+        <w:t xml:space="preserve">La cuenta de demostración no puede borrarse del todo: sin la service role key los usuarios de Auth quedan, aunque sin datos (npm run demo:borrar). El mensaje de bienvenida lo escribe el disparador al registrarse, así que conserva la fecha real y no se puede adelantar en el tiempo.</w:t>
       </w:r>
     </w:p>
     <w:p>

</xml_diff>

<commit_message>
docs: memoria técnica con el detalle de la oferta, LinkedIn, RemoteOK, el hallazgo de rendimiento y las cifras finales
</commit_message>
<xml_diff>
--- a/Laburin-Memoria-Tecnica.docx
+++ b/Laburin-Memoria-Tecnica.docx
@@ -1070,15 +1070,15 @@
         <w:spacing w:after="140" w:before="280"/>
       </w:pPr>
       <w:r>
-        <w:t xml:space="preserve">5.3 Dos fuentes externas en vez de las siete originales</w:t>
-      </w:r>
-    </w:p>
-    <w:p>
-      <w:pPr>
-        <w:spacing w:after="160"/>
-      </w:pPr>
-      <w:r>
-        <w:t xml:space="preserve">El antecedente (v5.0) consultaba 7 fuentes, incluyendo el parseo de HTML del endpoint público de LinkedIn — identificado en la propia SRS (§3.2) como "la más frágil: no es JSON, se parsea con regex; cualquier cambio de markup la rompe". Se evaluó portar las 7 y se descartó: Remotive y Arbeitnow exponen API REST JSON pública y estable, mientras que sumar LinkedIn (parseo HTML no oficial) y las fuentes restantes (Indeed AR, GetOnBrd, Vacantes Digitales, Himalayas) hubiera sumado superficie de mantenimiento sin aportar directamente al objetivo central de la PPS. Se priorizó profundidad en scoring/tablero/ficha por sobre amplitud de fuentes.</w:t>
+        <w:t xml:space="preserve">5.3 Pocas fuentes externas en vez de las siete originales</w:t>
+      </w:r>
+    </w:p>
+    <w:p>
+      <w:pPr>
+        <w:spacing w:after="160"/>
+      </w:pPr>
+      <w:r>
+        <w:t xml:space="preserve">El antecedente (v5.0) consultaba 7 fuentes, incluyendo el parseo de HTML del endpoint público de LinkedIn — identificado en la propia SRS (§3.2) como "la más frágil: no es JSON, se parsea con regex; cualquier cambio de markup la rompe". Se evaluó portar las 7 y se descartó: Remotive y Arbeitnow (a las que después se sumó RemoteOK, ver 5.16) exponen API REST JSON pública y estable, mientras que sumar LinkedIn (parseo HTML no oficial) y las fuentes restantes (Indeed AR, GetOnBrd, Vacantes Digitales, Himalayas) hubiera sumado superficie de mantenimiento sin aportar directamente al objetivo central de la PPS. Se priorizó profundidad en scoring/tablero/ficha por sobre amplitud de fuentes.</w:t>
       </w:r>
     </w:p>
     <w:p>
@@ -1271,7 +1271,7 @@
         <w:spacing w:after="160"/>
       </w:pPr>
       <w:r>
-        <w:t xml:space="preserve">Decisión con alternativa: los scripts solo se permiten desde el propio sitio, sin «unsafe-inline» ni «unsafe-eval», que es lo que realmente frena un XSS. En cambio los estilos sí permiten «unsafe-inline»: la alternativa, un nonce distinto por respuesta, no es posible con un sitio estático servido por Vercel, y React escribe estilos en línea (por ejemplo en las barras de progreso y en los gráficos). Es un riesgo menor, porque un estilo no ejecuta código. Las conexiones salen solo hacia Supabase (https y wss) y las dos fuentes de ofertas, y Google Fonts es el único recurso externo permitido.</w:t>
+        <w:t xml:space="preserve">Decisión con alternativa: los scripts solo se permiten desde el propio sitio, sin «unsafe-inline» ni «unsafe-eval», que es lo que realmente frena un XSS. En cambio los estilos sí permiten «unsafe-inline»: la alternativa, un nonce distinto por respuesta, no es posible con un sitio estático servido por Vercel, y React escribe estilos en línea (por ejemplo en las barras de progreso y en los gráficos). Es un riesgo menor, porque un estilo no ejecuta código. Las conexiones salen solo hacia Supabase (https y wss) y las tres fuentes de ofertas, y Google Fonts es el único recurso externo permitido.</w:t>
       </w:r>
     </w:p>
     <w:p>
@@ -1342,6 +1342,80 @@
     </w:p>
     <w:p>
       <w:pPr>
+        <w:pStyle w:val="Heading2"/>
+        <w:spacing w:after="140" w:before="280"/>
+      </w:pPr>
+      <w:r>
+        <w:t xml:space="preserve">5.15 El detalle de la oferta es un panel y guarda el enlace de origen</w:t>
+      </w:r>
+    </w:p>
+    <w:p>
+      <w:pPr>
+        <w:spacing w:after="160"/>
+      </w:pPr>
+      <w:r>
+        <w:t xml:space="preserve">Las fuentes externas mandan, junto a cada oferta, el enlace a la publicación original y su descripción, pero la importación los descartaba, así que no había forma de postularse desde Laburin. Se agregaron dos columnas opcionales a las ofertas (url y descripcion), con restricciones en la base: el enlace tiene que empezar con http o https y la descripción no puede pasar de 5000 caracteres. Un clic en la tarjeta abre un panel lateral con el puntaje explicado criterio por criterio, la descripción y el botón «Ver oferta y postularme».</w:t>
+      </w:r>
+    </w:p>
+    <w:p>
+      <w:pPr>
+        <w:spacing w:after="160"/>
+      </w:pPr>
+      <w:r>
+        <w:t xml:space="preserve">Decisión con alternativa: se descartó desplegar la tarjeta en la propia lista, porque desordena la grilla paginada y los filtros, y es largo en el celular, y también una pantalla aparte, porque se pierde el lugar en la lista. Un panel reutiliza el patrón de la ficha de postulación (que ya existía), mantiene la lista a la vista y en el celular ocupa toda la pantalla. El desglose del puntaje usa la misma función de coincidencia que el motor de scoring (un test comprueba que lo que coincide suma exactamente el puntaje), así que lo que se explica es lo que se calculó.</w:t>
+      </w:r>
+    </w:p>
+    <w:p>
+      <w:pPr>
+        <w:spacing w:after="160"/>
+      </w:pPr>
+      <w:r>
+        <w:t xml:space="preserve">Como el enlace y la descripción vienen de un tercero, se trataron como datos no confiables. El enlace se valida antes de guardarlo y antes de abrirlo: solo http y https, sin usuario ni clave en la dirección, sin javascript: ni data:. Se abre en otra pestaña con noopener y noreferrer, de modo que el sitio de destino no tiene acceso a la ventana de Laburin (una prueba lo verifica con un navegador real). La descripción llega como HTML: se convierte a texto plano al importar (se quitan las etiquetas y el contenido de scripts y estilos) y se muestra como texto, nunca como HTML. Una prueba importa una oferta con un enlace javascript: y una descripción con imágenes y scripts maliciosos y comprueba que no se guarda el enlace, que el texto se ve inofensivo y que no se ejecuta nada.</w:t>
+      </w:r>
+    </w:p>
+    <w:p>
+      <w:pPr>
+        <w:spacing w:after="160"/>
+      </w:pPr>
+      <w:r>
+        <w:t xml:space="preserve">Las fuentes piden, a cambio de usar su API, que se enlace a la oferta original y se las nombre como fuente: el panel muestra la fuente y lleva siempre al sitio de origen, donde se completa la postulación. Remotive además prohíbe publicar sus ofertas en otros portales, entre ellos LinkedIn, algo que Laburin no hace.</w:t>
+      </w:r>
+    </w:p>
+    <w:p>
+      <w:pPr>
+        <w:spacing w:after="160"/>
+      </w:pPr>
+      <w:r>
+        <w:t xml:space="preserve">Las ofertas importadas antes de esta mejora no tenían enlace. En lugar de pedir que se borren y se vuelvan a importar, la importación completa el enlace y la descripción de las que ya estaban guardadas (se emparejan por empresa, rol y fuente, como la deduplicación) sin tocar su puntaje, y avisa cuántas completó.</w:t>
+      </w:r>
+    </w:p>
+    <w:p>
+      <w:pPr>
+        <w:pStyle w:val="Heading2"/>
+        <w:spacing w:after="140" w:before="280"/>
+      </w:pPr>
+      <w:r>
+        <w:t xml:space="preserve">5.16 LinkedIn: un enlace de búsqueda, no una integración</w:t>
+      </w:r>
+    </w:p>
+    <w:p>
+      <w:pPr>
+        <w:spacing w:after="160"/>
+      </w:pPr>
+      <w:r>
+        <w:t xml:space="preserve">Se evaluó importar ofertas de LinkedIn con su API. LinkedIn no ofrece una API pública de búsqueda de empleos: sus interfaces de empleo son solo para socios aprobados y están pensadas para publicar ofertas, no para leerlas. Obtenerlas de otra forma, raspando su sitio, va contra sus términos de uso, es frágil (es lo que el antecedente hacía y la propia SRS marcaba como la fuente más frágil) y expone a la cuenta a bloqueos. Por eso no se implementó.</w:t>
+      </w:r>
+    </w:p>
+    <w:p>
+      <w:pPr>
+        <w:spacing w:after="160"/>
+      </w:pPr>
+      <w:r>
+        <w:t xml:space="preserve">En su lugar, el botón «Buscar en LinkedIn» abre el buscador de empleos de LinkedIn en otra pestaña, con el rol, la ubicación y la modalidad del perfil de búsqueda ya cargados (la modalidad se traduce a su filtro: presencial, remoto o híbrido). Es honesto, no depende de nada no oficial y sirve igual: lo que la persona encuentra ahí puede cargarlo a mano, con su enlace, y Laburin lo puntúa como a las demás. Para tener más ofertas dentro de Laburin se sumó RemoteOK, una API pública con etiquetas de tecnologías (que alimentan el puntaje), siguiendo sus condiciones de uso. Se agregó a la política de contenido, que solo permite conectarse a las fuentes conocidas.</w:t>
+      </w:r>
+    </w:p>
+    <w:p>
+      <w:pPr>
         <w:pStyle w:val="Heading1"/>
         <w:spacing w:after="200" w:before="400"/>
       </w:pPr>
@@ -1662,6 +1736,19 @@
     </w:p>
     <w:p>
       <w:pPr>
+        <w:pStyle w:val="ListParagraph"/>
+        <w:numPr>
+          <w:ilvl w:val="0"/>
+          <w:numId w:val="2"/>
+        </w:numPr>
+        <w:spacing w:after="80"/>
+      </w:pPr>
+      <w:r>
+        <w:t xml:space="preserve">Enlaces y descripciones de terceros: el enlace solo se abre si es http o https y la descripción se muestra como texto plano; aun así, el sitio de destino es de un tercero y Laburin no controla su contenido (Sección 5.15).</w:t>
+      </w:r>
+    </w:p>
+    <w:p>
+      <w:pPr>
         <w:pStyle w:val="Heading2"/>
         <w:spacing w:after="140" w:before="280"/>
       </w:pPr>
@@ -1831,7 +1918,7 @@
         <w:spacing w:after="160"/>
       </w:pPr>
       <w:r>
-        <w:t xml:space="preserve">Cifras de la corrida final completa (desktop y mobile, contra la base real): 286 tests unitarios de Vitest en 27 archivos y 112 tests de Playwright, ninguno salteado. De los 112, 2 son sesiones de preparación, 61 corren en desktop (13 de ellos son las pruebas de seguridad contra la base, que hablan directo con la API y por eso corren una sola vez) y 49 corren en mobile. En la corrida completa pasaron 111 y uno falló una vez por una interrupción de red; repetido solo, pasó las 3 veces. El test del teclado virtual solo aplica a mobile y se excluye del proyecto desktop por configuración, en lugar de figurar como salteado en cada corrida.</w:t>
+        <w:t xml:space="preserve">Cifras de la corrida final completa (desktop y mobile, contra la base real): 311 tests unitarios de Vitest en 28 archivos y 128 tests de Playwright, todos en verde y ninguno salteado. De los 128, 2 son sesiones de preparación, 69 corren en desktop (13 de ellos son las pruebas de seguridad contra la base, que hablan directo con la API y por eso corren una sola vez) y 57 corren en mobile. El test del teclado virtual solo aplica a mobile y se excluye del proyecto desktop por configuración, en lugar de figurar como salteado en cada corrida.</w:t>
       </w:r>
     </w:p>
     <w:p>
@@ -1873,6 +1960,31 @@
         <w:spacing w:after="140" w:before="280"/>
       </w:pPr>
       <w:r>
+        <w:t xml:space="preserve">Pase del detalle de la oferta</w:t>
+      </w:r>
+    </w:p>
+    <w:p>
+      <w:pPr>
+        <w:spacing w:after="160"/>
+      </w:pPr>
+      <w:r>
+        <w:t xml:space="preserve">El panel de detalle, el enlace de origen y la búsqueda en LinkedIn se cubrieron con 8 pruebas de navegador (en desktop y en mobile) y con pruebas unitarias de la lógica pura (validación del enlace, conversión de la descripción a texto plano, armado de la búsqueda de LinkedIn y desglose del puntaje, que coincide con el motor de scoring). Las pruebas de navegador verifican: que un clic en la tarjeta abre el panel con el puntaje explicado, la descripción y el enlace; que el enlace se abre en otra pestaña sin acceso a la ventana de Laburin; que Escape cierra el panel y devuelve el foco; que se puede guardar la postulación desde el panel; que una oferta sin enlace lo avisa y deja agregarlo validando que sea una dirección web; que la importación guarda el enlace de las tres fuentes y completa el de las ofertas ya guardadas; y que un enlace o una descripción maliciosos de una fuente externa ni se abren ni se ejecutan. El panel también entró en la auditoría de accesibilidad y en la de ancho de celular.</w:t>
+      </w:r>
+    </w:p>
+    <w:p>
+      <w:pPr>
+        <w:spacing w:after="160"/>
+      </w:pPr>
+      <w:r>
+        <w:t xml:space="preserve">Hallazgos de este pase que se corrigieron: la auditoría automática encontró que el contenido desplazable del panel no se podía recorrer con el teclado (se le dio foco y una etiqueta), y las pruebas de importación mostraron un problema de rendimiento real: al sumar la tercera fuente se importaban unas 300 ofertas de una vez y cada una se guardaba con su propia secuencia de pedidos a la base, lo que hacía pasar la importación de los 90 segundos. Se cambió a guardar por tandas de 100, leyendo el usuario y los criterios una sola vez, y si una tanda falla se reintenta fila por fila para no perder las buenas ni ocultar las que fallan (un test unitario cubre los tres casos).</w:t>
+      </w:r>
+    </w:p>
+    <w:p>
+      <w:pPr>
+        <w:pStyle w:val="Heading2"/>
+        <w:spacing w:after="140" w:before="280"/>
+      </w:pPr>
+      <w:r>
         <w:t xml:space="preserve">Bugs de producción</w:t>
       </w:r>
     </w:p>
@@ -2063,7 +2175,7 @@
         <w:spacing w:after="80"/>
       </w:pPr>
       <w:r>
-        <w:t xml:space="preserve">Solo 2 de las 7 fuentes originales, sin automatización periódica: la búsqueda de ofertas externas depende de que el usuario toque "Importar" — no hay job de fondo (Sección 5.2 y 5.3).</w:t>
+        <w:t xml:space="preserve">Solo 3 de las 7 fuentes originales (Remotive, Arbeitnow y RemoteOK), sin automatización periódica: la búsqueda de ofertas externas depende de que el usuario toque "Importar" — no hay job de fondo (Sección 5.2 y 5.3).</w:t>
       </w:r>
     </w:p>
     <w:p>
@@ -2416,7 +2528,7 @@
                 <w:sz w:val="19"/>
                 <w:szCs w:val="19"/>
               </w:rPr>
-              <w:t xml:space="preserve">Solo 2 de las 7 fuentes (Remotive, Arbeitnow); importación manual, no automatizada ni periódica.</w:t>
+              <w:t xml:space="preserve">Solo 3 de las 7 fuentes (Remotive, Arbeitnow, RemoteOK); importación manual, no automatizada ni periódica.</w:t>
             </w:r>
           </w:p>
         </w:tc>

</xml_diff>